<commit_message>
포아송비 76건 — VHB 는 0.49 가 아니라 0.35 였다 (15,785 → 15,861)
3M 이 2022년 이후 개정판에서 Poisson's Ratio 행을 삭제해 현행 TDS 로는
못 받는다. 구 개정판 미러에 남아 있고, DB 에 이미 같은 표의 Shear Modulus
가 tier1 로 들어와 있었다 — 앞선 파동이 위 행만 읽고 ν 행을 지나쳤다.

빈 문자열 DOI 가 UNIQUE 제약에 걸려 인제스트를 중간에 죽이고 있었다.
'' 는 falsy 라 dedup 조회도 건너뛴다 — None 으로 정규화했다.

가정값 검사가 conditions 의 부분문자열 'assumption' 을 찾다가 방법 서술
("isotropic assumption")에 오탐을 냈다. 구조 표지만 보도록 좁혔다.

Co-Authored-By: Claude Opus 5 (1M context) <noreply@anthropic.com>
</commit_message>
<xml_diff>
--- a/MaterialTwin_물성확보현황_해석가능성.docx
+++ b/MaterialTwin_물성확보현황_해석가능성.docx
@@ -31,7 +31,7 @@
           <w:color w:val="606060"/>
           <w:sz w:val="18"/>
         </w:rPr>
-        <w:t>2026-08-06 · 재료 544종 · 물성값 15,785건 · 출처 1,873건 · 물성 정의 157종</w:t>
+        <w:t>2026-08-06 · 재료 544종 · 물성값 15,861건 · 출처 1,899건 · 물성 정의 157종</w:t>
       </w:r>
     </w:p>
     <w:p/>
@@ -52,7 +52,7 @@
           <w:b/>
           <w:sz w:val="22"/>
         </w:rPr>
-        <w:t>12개 해석이 요구하는 (재료 × 필수물성) 격자 14,490칸 중 9,217칸이 채워졌다 — 전체 63.6%.</w:t>
+        <w:t>12개 해석이 요구하는 (재료 × 필수물성) 격자 14,490칸 중 9,218칸이 채워졌다 — 전체 63.6%.</w:t>
       </w:r>
     </w:p>
     <w:p>
@@ -726,7 +726,7 @@
               <w:rPr>
                 <w:sz w:val="15"/>
               </w:rPr>
-              <w:t>489/740</w:t>
+              <w:t>490/740</w:t>
             </w:r>
           </w:p>
         </w:tc>
@@ -740,7 +740,7 @@
               <w:rPr>
                 <w:sz w:val="15"/>
               </w:rPr>
-              <w:t>66.1%  █████████·····</w:t>
+              <w:t>66.2%  █████████·····</w:t>
             </w:r>
           </w:p>
         </w:tc>
@@ -754,7 +754,7 @@
               <w:rPr>
                 <w:sz w:val="15"/>
               </w:rPr>
-              <w:t>29  (15.7%)</w:t>
+              <w:t>30  (16.2%)</w:t>
             </w:r>
           </w:p>
         </w:tc>
@@ -768,7 +768,7 @@
               <w:rPr>
                 <w:sz w:val="15"/>
               </w:rPr>
-              <w:t>prony_relaxation_time | prony_tensile_mo — 146종</w:t>
+              <w:t>prony_relaxation_time | prony_tensile_mo — 145종</w:t>
             </w:r>
           </w:p>
         </w:tc>
@@ -2975,7 +2975,7 @@
               <w:rPr>
                 <w:sz w:val="16"/>
               </w:rPr>
-              <w:t>489/740  (66.1%)</w:t>
+              <w:t>490/740  (66.2%)</w:t>
             </w:r>
           </w:p>
         </w:tc>
@@ -2989,7 +2989,7 @@
               <w:rPr>
                 <w:sz w:val="16"/>
               </w:rPr>
-              <w:t>29종  (15.7%)</w:t>
+              <w:t>30종  (16.2%)</w:t>
             </w:r>
           </w:p>
         </w:tc>
@@ -3076,7 +3076,7 @@
               <w:rPr>
                 <w:sz w:val="16"/>
               </w:rPr>
-              <w:t>146종</w:t>
+              <w:t>145종</w:t>
             </w:r>
           </w:p>
         </w:tc>
@@ -5360,7 +5360,7 @@
               <w:rPr>
                 <w:sz w:val="15"/>
               </w:rPr>
-              <w:t>527건</w:t>
+              <w:t>586건</w:t>
             </w:r>
           </w:p>
         </w:tc>
@@ -8404,7 +8404,7 @@
               <w:rPr>
                 <w:sz w:val="16"/>
               </w:rPr>
-              <w:t>6,212건</w:t>
+              <w:t>6,288건</w:t>
             </w:r>
           </w:p>
         </w:tc>
@@ -9127,7 +9127,7 @@
               <w:rPr>
                 <w:sz w:val="16"/>
               </w:rPr>
-              <w:t>6,805건</w:t>
+              <w:t>6,831건</w:t>
             </w:r>
           </w:p>
         </w:tc>
@@ -9141,7 +9141,7 @@
               <w:rPr>
                 <w:sz w:val="16"/>
               </w:rPr>
-              <w:t>22.7</w:t>
+              <w:t>22.8</w:t>
             </w:r>
           </w:p>
         </w:tc>
@@ -9185,7 +9185,7 @@
               <w:rPr>
                 <w:sz w:val="16"/>
               </w:rPr>
-              <w:t>2,824건</w:t>
+              <w:t>2,829건</w:t>
             </w:r>
           </w:p>
         </w:tc>
@@ -9199,7 +9199,7 @@
               <w:rPr>
                 <w:sz w:val="16"/>
               </w:rPr>
-              <w:t>35.3</w:t>
+              <w:t>35.4</w:t>
             </w:r>
           </w:p>
         </w:tc>
@@ -9243,7 +9243,7 @@
               <w:rPr>
                 <w:sz w:val="16"/>
               </w:rPr>
-              <w:t>3,661건</w:t>
+              <w:t>3,676건</w:t>
             </w:r>
           </w:p>
         </w:tc>
@@ -9257,7 +9257,7 @@
               <w:rPr>
                 <w:sz w:val="16"/>
               </w:rPr>
-              <w:t>49.5</w:t>
+              <w:t>49.7</w:t>
             </w:r>
           </w:p>
         </w:tc>
@@ -9301,7 +9301,7 @@
               <w:rPr>
                 <w:sz w:val="16"/>
               </w:rPr>
-              <w:t>1,491건</w:t>
+              <w:t>1,505건</w:t>
             </w:r>
           </w:p>
         </w:tc>
@@ -9315,7 +9315,7 @@
               <w:rPr>
                 <w:sz w:val="16"/>
               </w:rPr>
-              <w:t>33.9</w:t>
+              <w:t>34.2</w:t>
             </w:r>
           </w:p>
         </w:tc>
@@ -9359,7 +9359,7 @@
               <w:rPr>
                 <w:sz w:val="16"/>
               </w:rPr>
-              <w:t>631건</w:t>
+              <w:t>633건</w:t>
             </w:r>
           </w:p>
         </w:tc>
@@ -9373,7 +9373,7 @@
               <w:rPr>
                 <w:sz w:val="16"/>
               </w:rPr>
-              <w:t>26.3</w:t>
+              <w:t>26.4</w:t>
             </w:r>
           </w:p>
         </w:tc>
@@ -9417,7 +9417,7 @@
               <w:rPr>
                 <w:sz w:val="16"/>
               </w:rPr>
-              <w:t>373건</w:t>
+              <w:t>387건</w:t>
             </w:r>
           </w:p>
         </w:tc>
@@ -9431,7 +9431,7 @@
               <w:rPr>
                 <w:sz w:val="16"/>
               </w:rPr>
-              <w:t>17.0</w:t>
+              <w:t>17.6</w:t>
             </w:r>
           </w:p>
         </w:tc>
@@ -9577,7 +9577,7 @@
               <w:rPr>
                 <w:sz w:val="16"/>
               </w:rPr>
-              <w:t>9,349</w:t>
+              <w:t>9,371</w:t>
             </w:r>
           </w:p>
         </w:tc>
@@ -9591,7 +9591,7 @@
               <w:rPr>
                 <w:sz w:val="16"/>
               </w:rPr>
-              <w:t>59.2%</w:t>
+              <w:t>59.1%</w:t>
             </w:r>
           </w:p>
         </w:tc>
@@ -9635,7 +9635,7 @@
               <w:rPr>
                 <w:sz w:val="16"/>
               </w:rPr>
-              <w:t>1,633</w:t>
+              <w:t>1,634</w:t>
             </w:r>
           </w:p>
         </w:tc>
@@ -9693,7 +9693,7 @@
               <w:rPr>
                 <w:sz w:val="16"/>
               </w:rPr>
-              <w:t>2,701</w:t>
+              <w:t>2,754</w:t>
             </w:r>
           </w:p>
         </w:tc>
@@ -9707,7 +9707,7 @@
               <w:rPr>
                 <w:sz w:val="16"/>
               </w:rPr>
-              <w:t>17.1%</w:t>
+              <w:t>17.4%</w:t>
             </w:r>
           </w:p>
         </w:tc>
@@ -9781,7 +9781,7 @@
           <w:b w:val="0"/>
           <w:sz w:val="19"/>
         </w:rPr>
-        <w:t>가정값 2,014건은 조건에 assumption 표지가 붙어 UI·카드에 “가정”으로 표시된다. 대표값 선택에서 실측에 밀리므로, 나중에 실측이 들어오면 자동으로 대체된다.</w:t>
+        <w:t>가정값 2,017건은 조건에 assumption 표지가 붙어 UI·카드에 “가정”으로 표시된다. 대표값 선택에서 실측에 밀리므로, 나중에 실측이 들어오면 자동으로 대체된다.</w:t>
       </w:r>
     </w:p>
     <w:p>
@@ -9864,7 +9864,7 @@
               <w:rPr>
                 <w:sz w:val="16"/>
               </w:rPr>
-              <w:t>850</w:t>
+              <w:t>861</w:t>
             </w:r>
           </w:p>
         </w:tc>
@@ -9894,7 +9894,7 @@
               <w:rPr>
                 <w:sz w:val="16"/>
               </w:rPr>
-              <w:t>550</w:t>
+              <w:t>560</w:t>
             </w:r>
           </w:p>
         </w:tc>
@@ -9924,7 +9924,7 @@
               <w:rPr>
                 <w:sz w:val="16"/>
               </w:rPr>
-              <w:t>282</w:t>
+              <w:t>284</w:t>
             </w:r>
           </w:p>
         </w:tc>
@@ -9984,7 +9984,7 @@
               <w:rPr>
                 <w:sz w:val="16"/>
               </w:rPr>
-              <w:t>64</w:t>
+              <w:t>66</w:t>
             </w:r>
           </w:p>
         </w:tc>
@@ -10044,7 +10044,7 @@
               <w:rPr>
                 <w:sz w:val="16"/>
               </w:rPr>
-              <w:t>19</w:t>
+              <w:t>20</w:t>
             </w:r>
           </w:p>
         </w:tc>

</xml_diff>